<commit_message>
docs: add implementation status labels to LLD (IMPLEMENTED / TARGET STATE)
Makes the as-built vs. target-state distinction explicit for reviewers:
- Adds Implementation Status Legend (IMPLEMENTED / PARTIAL / TARGET STATE / NA)
- Adds Implementation Status Matrix summarizing all 28 sections
- Adds Known Deviations table (LLaMA vs GPT-4.1-mini, LangGraph vs step
  machine, delivery ID pattern, etc.)
- Adds per-Part status banners for Parts III, IV, V, VI
- Adds per-section TARGET STATE banners on §20, §21, §22, §25, §26
- Regenerates Word doc to match

https://claude.ai/code/session_01DrgnPcNZwT3sP1KicyS29b
</commit_message>
<xml_diff>
--- a/docs/LLD_AdminFeeAgent.docx
+++ b/docs/LLD_AdminFeeAgent.docx
@@ -207,7 +207,7 @@
           <w:p>
             <w:r/>
             <w:r>
-              <w:t>1.0 (Draft)</w:t>
+              <w:t>1.0</w:t>
             </w:r>
           </w:p>
         </w:tc>
@@ -259,7 +259,2275 @@
           <w:p>
             <w:r/>
             <w:r>
-              <w:t>Draft — Section 1 Complete</w:t>
+              <w:t>Complete — All 28 sections filled</w:t>
+            </w:r>
+          </w:p>
+        </w:tc>
+      </w:tr>
+    </w:tbl>
+    <w:p/>
+    <w:p>
+      <w:pPr>
+        <w:pStyle w:val="Heading1"/>
+      </w:pPr>
+      <w:r>
+        <w:rPr>
+          <w:color w:val="1F4E79"/>
+        </w:rPr>
+        <w:t>Implementation Status Legend</w:t>
+      </w:r>
+    </w:p>
+    <w:p>
+      <w:r>
+        <w:t xml:space="preserve">This document mixes </w:t>
+      </w:r>
+      <w:r>
+        <w:rPr>
+          <w:b/>
+        </w:rPr>
+        <w:t>current reality</w:t>
+      </w:r>
+      <w:r>
+        <w:t xml:space="preserve"> with </w:t>
+      </w:r>
+      <w:r>
+        <w:rPr>
+          <w:b/>
+        </w:rPr>
+        <w:t>target-state design</w:t>
+      </w:r>
+      <w:r>
+        <w:t>. Every subsection is tagged with one of the following labels so reviewers can tell them apart:</w:t>
+      </w:r>
+    </w:p>
+    <w:tbl>
+      <w:tblPr>
+        <w:tblStyle w:val="LightGrid-Accent1"/>
+        <w:tblW w:type="auto" w:w="0"/>
+        <w:tblLook w:firstColumn="1" w:firstRow="1" w:lastColumn="0" w:lastRow="0" w:noHBand="0" w:noVBand="1" w:val="04A0"/>
+      </w:tblPr>
+      <w:tblGrid>
+        <w:gridCol w:w="4320"/>
+        <w:gridCol w:w="4320"/>
+      </w:tblGrid>
+      <w:tr>
+        <w:tc>
+          <w:tcPr>
+            <w:tcW w:type="dxa" w:w="4320"/>
+            <w:shd w:fill="1F4E79"/>
+            <w:vAlign w:val="center"/>
+          </w:tcPr>
+          <w:p>
+            <w:r>
+              <w:rPr>
+                <w:b/>
+                <w:color w:val="FFFFFF"/>
+              </w:rPr>
+            </w:r>
+            <w:r>
+              <w:rPr>
+                <w:b/>
+                <w:color w:val="FFFFFF"/>
+              </w:rPr>
+              <w:t>Label</w:t>
+            </w:r>
+          </w:p>
+        </w:tc>
+        <w:tc>
+          <w:tcPr>
+            <w:tcW w:type="dxa" w:w="4320"/>
+            <w:shd w:fill="1F4E79"/>
+            <w:vAlign w:val="center"/>
+          </w:tcPr>
+          <w:p>
+            <w:r>
+              <w:rPr>
+                <w:b/>
+                <w:color w:val="FFFFFF"/>
+              </w:rPr>
+            </w:r>
+            <w:r>
+              <w:rPr>
+                <w:b/>
+                <w:color w:val="FFFFFF"/>
+              </w:rPr>
+              <w:t>Meaning</w:t>
+            </w:r>
+          </w:p>
+        </w:tc>
+      </w:tr>
+      <w:tr>
+        <w:tc>
+          <w:tcPr>
+            <w:tcW w:type="dxa" w:w="4320"/>
+            <w:vAlign w:val="center"/>
+          </w:tcPr>
+          <w:p>
+            <w:r/>
+            <w:r>
+              <w:rPr>
+                <w:b/>
+              </w:rPr>
+              <w:t>IMPLEMENTED</w:t>
+            </w:r>
+          </w:p>
+        </w:tc>
+        <w:tc>
+          <w:tcPr>
+            <w:tcW w:type="dxa" w:w="4320"/>
+            <w:vAlign w:val="center"/>
+          </w:tcPr>
+          <w:p>
+            <w:r/>
+            <w:r>
+              <w:t>Already exists and working in the codebase today</w:t>
+            </w:r>
+          </w:p>
+        </w:tc>
+      </w:tr>
+      <w:tr>
+        <w:tc>
+          <w:tcPr>
+            <w:tcW w:type="dxa" w:w="4320"/>
+            <w:vAlign w:val="center"/>
+          </w:tcPr>
+          <w:p>
+            <w:r/>
+            <w:r>
+              <w:rPr>
+                <w:b/>
+              </w:rPr>
+              <w:t>PARTIAL</w:t>
+            </w:r>
+          </w:p>
+        </w:tc>
+        <w:tc>
+          <w:tcPr>
+            <w:tcW w:type="dxa" w:w="4320"/>
+            <w:vAlign w:val="center"/>
+          </w:tcPr>
+          <w:p>
+            <w:r/>
+            <w:r>
+              <w:t>Some of it exists in code; rest is target state</w:t>
+            </w:r>
+          </w:p>
+        </w:tc>
+      </w:tr>
+      <w:tr>
+        <w:tc>
+          <w:tcPr>
+            <w:tcW w:type="dxa" w:w="4320"/>
+            <w:vAlign w:val="center"/>
+          </w:tcPr>
+          <w:p>
+            <w:r/>
+            <w:r>
+              <w:rPr>
+                <w:b/>
+              </w:rPr>
+              <w:t>TARGET STATE</w:t>
+            </w:r>
+          </w:p>
+        </w:tc>
+        <w:tc>
+          <w:tcPr>
+            <w:tcW w:type="dxa" w:w="4320"/>
+            <w:vAlign w:val="center"/>
+          </w:tcPr>
+          <w:p>
+            <w:r/>
+            <w:r>
+              <w:t>Not yet built — documented as the intended future design</w:t>
+            </w:r>
+          </w:p>
+        </w:tc>
+      </w:tr>
+      <w:tr>
+        <w:tc>
+          <w:tcPr>
+            <w:tcW w:type="dxa" w:w="4320"/>
+            <w:vAlign w:val="center"/>
+          </w:tcPr>
+          <w:p>
+            <w:r/>
+            <w:r>
+              <w:rPr>
+                <w:b/>
+              </w:rPr>
+              <w:t>NA</w:t>
+            </w:r>
+          </w:p>
+        </w:tc>
+        <w:tc>
+          <w:tcPr>
+            <w:tcW w:type="dxa" w:w="4320"/>
+            <w:vAlign w:val="center"/>
+          </w:tcPr>
+          <w:p>
+            <w:r/>
+            <w:r>
+              <w:t>Not applicable to this application (now or later)</w:t>
+            </w:r>
+          </w:p>
+        </w:tc>
+      </w:tr>
+    </w:tbl>
+    <w:p/>
+    <w:p>
+      <w:pPr>
+        <w:pStyle w:val="Heading1"/>
+      </w:pPr>
+      <w:r>
+        <w:rPr>
+          <w:color w:val="1F4E79"/>
+        </w:rPr>
+        <w:t>Implementation Status Matrix</w:t>
+      </w:r>
+    </w:p>
+    <w:p>
+      <w:r>
+        <w:t>High-level summary of what is real today vs. planned. Detailed per-subsection status labels appear inline throughout the document.</w:t>
+      </w:r>
+    </w:p>
+    <w:tbl>
+      <w:tblPr>
+        <w:tblStyle w:val="LightGrid-Accent1"/>
+        <w:tblW w:type="auto" w:w="0"/>
+        <w:tblLook w:firstColumn="1" w:firstRow="1" w:lastColumn="0" w:lastRow="0" w:noHBand="0" w:noVBand="1" w:val="04A0"/>
+      </w:tblPr>
+      <w:tblGrid>
+        <w:gridCol w:w="2880"/>
+        <w:gridCol w:w="2880"/>
+        <w:gridCol w:w="2880"/>
+      </w:tblGrid>
+      <w:tr>
+        <w:tc>
+          <w:tcPr>
+            <w:tcW w:type="dxa" w:w="2880"/>
+            <w:shd w:fill="1F4E79"/>
+            <w:vAlign w:val="center"/>
+          </w:tcPr>
+          <w:p>
+            <w:r>
+              <w:rPr>
+                <w:b/>
+                <w:color w:val="FFFFFF"/>
+              </w:rPr>
+            </w:r>
+            <w:r>
+              <w:rPr>
+                <w:b/>
+                <w:color w:val="FFFFFF"/>
+              </w:rPr>
+              <w:t>Section</w:t>
+            </w:r>
+          </w:p>
+        </w:tc>
+        <w:tc>
+          <w:tcPr>
+            <w:tcW w:type="dxa" w:w="2880"/>
+            <w:shd w:fill="1F4E79"/>
+            <w:vAlign w:val="center"/>
+          </w:tcPr>
+          <w:p>
+            <w:r>
+              <w:rPr>
+                <w:b/>
+                <w:color w:val="FFFFFF"/>
+              </w:rPr>
+            </w:r>
+            <w:r>
+              <w:rPr>
+                <w:b/>
+                <w:color w:val="FFFFFF"/>
+              </w:rPr>
+              <w:t>Area</w:t>
+            </w:r>
+          </w:p>
+        </w:tc>
+        <w:tc>
+          <w:tcPr>
+            <w:tcW w:type="dxa" w:w="2880"/>
+            <w:shd w:fill="1F4E79"/>
+            <w:vAlign w:val="center"/>
+          </w:tcPr>
+          <w:p>
+            <w:r>
+              <w:rPr>
+                <w:b/>
+                <w:color w:val="FFFFFF"/>
+              </w:rPr>
+            </w:r>
+            <w:r>
+              <w:rPr>
+                <w:b/>
+                <w:color w:val="FFFFFF"/>
+              </w:rPr>
+              <w:t>Current Status</w:t>
+            </w:r>
+          </w:p>
+        </w:tc>
+      </w:tr>
+      <w:tr>
+        <w:tc>
+          <w:tcPr>
+            <w:tcW w:type="dxa" w:w="2880"/>
+            <w:vAlign w:val="center"/>
+          </w:tcPr>
+          <w:p>
+            <w:r/>
+            <w:r>
+              <w:t>1</w:t>
+            </w:r>
+          </w:p>
+        </w:tc>
+        <w:tc>
+          <w:tcPr>
+            <w:tcW w:type="dxa" w:w="2880"/>
+            <w:vAlign w:val="center"/>
+          </w:tcPr>
+          <w:p>
+            <w:r/>
+            <w:r>
+              <w:t>Product Vision &amp; Problem Statement</w:t>
+            </w:r>
+          </w:p>
+        </w:tc>
+        <w:tc>
+          <w:tcPr>
+            <w:tcW w:type="dxa" w:w="2880"/>
+            <w:vAlign w:val="center"/>
+          </w:tcPr>
+          <w:p>
+            <w:r/>
+            <w:r>
+              <w:rPr>
+                <w:b/>
+              </w:rPr>
+              <w:t>IMPLEMENTED</w:t>
+            </w:r>
+            <w:r>
+              <w:t xml:space="preserve"> — mission, users, non-goals reflect shipped product</w:t>
+            </w:r>
+          </w:p>
+        </w:tc>
+      </w:tr>
+      <w:tr>
+        <w:tc>
+          <w:tcPr>
+            <w:tcW w:type="dxa" w:w="2880"/>
+            <w:vAlign w:val="center"/>
+          </w:tcPr>
+          <w:p>
+            <w:r/>
+            <w:r>
+              <w:t>2</w:t>
+            </w:r>
+          </w:p>
+        </w:tc>
+        <w:tc>
+          <w:tcPr>
+            <w:tcW w:type="dxa" w:w="2880"/>
+            <w:vAlign w:val="center"/>
+          </w:tcPr>
+          <w:p>
+            <w:r/>
+            <w:r>
+              <w:t>Agent Identity, Persona &amp; Voice</w:t>
+            </w:r>
+          </w:p>
+        </w:tc>
+        <w:tc>
+          <w:tcPr>
+            <w:tcW w:type="dxa" w:w="2880"/>
+            <w:vAlign w:val="center"/>
+          </w:tcPr>
+          <w:p>
+            <w:r/>
+            <w:r>
+              <w:rPr>
+                <w:b/>
+              </w:rPr>
+              <w:t>IMPLEMENTED</w:t>
+            </w:r>
+            <w:r>
+              <w:t xml:space="preserve"> — tone/voice matches live prompts in </w:t>
+            </w:r>
+            <w:r>
+              <w:rPr>
+                <w:rFonts w:ascii="Consolas" w:hAnsi="Consolas"/>
+                <w:sz w:val="20"/>
+              </w:rPr>
+              <w:t>prompts/</w:t>
+            </w:r>
+          </w:p>
+        </w:tc>
+      </w:tr>
+      <w:tr>
+        <w:tc>
+          <w:tcPr>
+            <w:tcW w:type="dxa" w:w="2880"/>
+            <w:vAlign w:val="center"/>
+          </w:tcPr>
+          <w:p>
+            <w:r/>
+            <w:r>
+              <w:t>3</w:t>
+            </w:r>
+          </w:p>
+        </w:tc>
+        <w:tc>
+          <w:tcPr>
+            <w:tcW w:type="dxa" w:w="2880"/>
+            <w:vAlign w:val="center"/>
+          </w:tcPr>
+          <w:p>
+            <w:r/>
+            <w:r>
+              <w:t>System Architecture Overview</w:t>
+            </w:r>
+          </w:p>
+        </w:tc>
+        <w:tc>
+          <w:tcPr>
+            <w:tcW w:type="dxa" w:w="2880"/>
+            <w:vAlign w:val="center"/>
+          </w:tcPr>
+          <w:p>
+            <w:r/>
+            <w:r>
+              <w:rPr>
+                <w:b/>
+              </w:rPr>
+              <w:t>IMPLEMENTED</w:t>
+            </w:r>
+            <w:r>
+              <w:t xml:space="preserve"> — 3-panel UI + FastAPI backend + MySQL + S3 + Airflow all live</w:t>
+            </w:r>
+          </w:p>
+        </w:tc>
+      </w:tr>
+      <w:tr>
+        <w:tc>
+          <w:tcPr>
+            <w:tcW w:type="dxa" w:w="2880"/>
+            <w:vAlign w:val="center"/>
+          </w:tcPr>
+          <w:p>
+            <w:r/>
+            <w:r>
+              <w:t>4</w:t>
+            </w:r>
+          </w:p>
+        </w:tc>
+        <w:tc>
+          <w:tcPr>
+            <w:tcW w:type="dxa" w:w="2880"/>
+            <w:vAlign w:val="center"/>
+          </w:tcPr>
+          <w:p>
+            <w:r/>
+            <w:r>
+              <w:t>Multi-Agent Topology</w:t>
+            </w:r>
+          </w:p>
+        </w:tc>
+        <w:tc>
+          <w:tcPr>
+            <w:tcW w:type="dxa" w:w="2880"/>
+            <w:vAlign w:val="center"/>
+          </w:tcPr>
+          <w:p>
+            <w:r/>
+            <w:r>
+              <w:rPr>
+                <w:b/>
+              </w:rPr>
+              <w:t>PARTIAL</w:t>
+            </w:r>
+            <w:r>
+              <w:t xml:space="preserve"> — web backend uses a step-based state machine, not LangGraph. LangGraph only in legacy CLI scripts (</w:t>
+            </w:r>
+            <w:r>
+              <w:rPr>
+                <w:rFonts w:ascii="Consolas" w:hAnsi="Consolas"/>
+                <w:sz w:val="20"/>
+              </w:rPr>
+              <w:t>adminfee_processing_agent.py</w:t>
+            </w:r>
+            <w:r>
+              <w:t xml:space="preserve">, </w:t>
+            </w:r>
+            <w:r>
+              <w:rPr>
+                <w:rFonts w:ascii="Consolas" w:hAnsi="Consolas"/>
+                <w:sz w:val="20"/>
+              </w:rPr>
+              <w:t>contract_analyst_agent_cot.py</w:t>
+            </w:r>
+            <w:r>
+              <w:t>)</w:t>
+            </w:r>
+          </w:p>
+        </w:tc>
+      </w:tr>
+      <w:tr>
+        <w:tc>
+          <w:tcPr>
+            <w:tcW w:type="dxa" w:w="2880"/>
+            <w:vAlign w:val="center"/>
+          </w:tcPr>
+          <w:p>
+            <w:r/>
+            <w:r>
+              <w:t>5</w:t>
+            </w:r>
+          </w:p>
+        </w:tc>
+        <w:tc>
+          <w:tcPr>
+            <w:tcW w:type="dxa" w:w="2880"/>
+            <w:vAlign w:val="center"/>
+          </w:tcPr>
+          <w:p>
+            <w:r/>
+            <w:r>
+              <w:t>LLM Strategy</w:t>
+            </w:r>
+          </w:p>
+        </w:tc>
+        <w:tc>
+          <w:tcPr>
+            <w:tcW w:type="dxa" w:w="2880"/>
+            <w:vAlign w:val="center"/>
+          </w:tcPr>
+          <w:p>
+            <w:r/>
+            <w:r>
+              <w:rPr>
+                <w:b/>
+              </w:rPr>
+              <w:t>PARTIAL</w:t>
+            </w:r>
+            <w:r>
+              <w:t xml:space="preserve"> — current code uses OpenAI </w:t>
+            </w:r>
+            <w:r>
+              <w:rPr>
+                <w:rFonts w:ascii="Consolas" w:hAnsi="Consolas"/>
+                <w:sz w:val="20"/>
+              </w:rPr>
+              <w:t>gpt-4.1-mini</w:t>
+            </w:r>
+            <w:r>
+              <w:t>; LLaMA 3.1 8B is target-state migration</w:t>
+            </w:r>
+          </w:p>
+        </w:tc>
+      </w:tr>
+      <w:tr>
+        <w:tc>
+          <w:tcPr>
+            <w:tcW w:type="dxa" w:w="2880"/>
+            <w:vAlign w:val="center"/>
+          </w:tcPr>
+          <w:p>
+            <w:r/>
+            <w:r>
+              <w:t>6</w:t>
+            </w:r>
+          </w:p>
+        </w:tc>
+        <w:tc>
+          <w:tcPr>
+            <w:tcW w:type="dxa" w:w="2880"/>
+            <w:vAlign w:val="center"/>
+          </w:tcPr>
+          <w:p>
+            <w:r/>
+            <w:r>
+              <w:t>Prompt Engineering</w:t>
+            </w:r>
+          </w:p>
+        </w:tc>
+        <w:tc>
+          <w:tcPr>
+            <w:tcW w:type="dxa" w:w="2880"/>
+            <w:vAlign w:val="center"/>
+          </w:tcPr>
+          <w:p>
+            <w:r/>
+            <w:r>
+              <w:rPr>
+                <w:b/>
+              </w:rPr>
+              <w:t>IMPLEMENTED</w:t>
+            </w:r>
+            <w:r>
+              <w:t xml:space="preserve"> — 7 prompt files in </w:t>
+            </w:r>
+            <w:r>
+              <w:rPr>
+                <w:rFonts w:ascii="Consolas" w:hAnsi="Consolas"/>
+                <w:sz w:val="20"/>
+              </w:rPr>
+              <w:t>prompts/</w:t>
+            </w:r>
+            <w:r>
+              <w:t xml:space="preserve"> (</w:t>
+            </w:r>
+            <w:r>
+              <w:rPr>
+                <w:rFonts w:ascii="Consolas" w:hAnsi="Consolas"/>
+                <w:sz w:val="20"/>
+              </w:rPr>
+              <w:t>delivery_normalizer.txt</w:t>
+            </w:r>
+            <w:r>
+              <w:t xml:space="preserve">, </w:t>
+            </w:r>
+            <w:r>
+              <w:rPr>
+                <w:rFonts w:ascii="Consolas" w:hAnsi="Consolas"/>
+                <w:sz w:val="20"/>
+              </w:rPr>
+              <w:t>sql_generator.txt</w:t>
+            </w:r>
+            <w:r>
+              <w:t>, etc.)</w:t>
+            </w:r>
+          </w:p>
+        </w:tc>
+      </w:tr>
+      <w:tr>
+        <w:tc>
+          <w:tcPr>
+            <w:tcW w:type="dxa" w:w="2880"/>
+            <w:vAlign w:val="center"/>
+          </w:tcPr>
+          <w:p>
+            <w:r/>
+            <w:r>
+              <w:t>7</w:t>
+            </w:r>
+          </w:p>
+        </w:tc>
+        <w:tc>
+          <w:tcPr>
+            <w:tcW w:type="dxa" w:w="2880"/>
+            <w:vAlign w:val="center"/>
+          </w:tcPr>
+          <w:p>
+            <w:r/>
+            <w:r>
+              <w:t>Tool Use &amp; Function Calling</w:t>
+            </w:r>
+          </w:p>
+        </w:tc>
+        <w:tc>
+          <w:tcPr>
+            <w:tcW w:type="dxa" w:w="2880"/>
+            <w:vAlign w:val="center"/>
+          </w:tcPr>
+          <w:p>
+            <w:r/>
+            <w:r>
+              <w:rPr>
+                <w:b/>
+              </w:rPr>
+              <w:t>PARTIAL</w:t>
+            </w:r>
+            <w:r>
+              <w:t xml:space="preserve"> — real tools differ: </w:t>
+            </w:r>
+            <w:r>
+              <w:rPr>
+                <w:rFonts w:ascii="Consolas" w:hAnsi="Consolas"/>
+                <w:sz w:val="20"/>
+              </w:rPr>
+              <w:t>insert_contracts_metadata</w:t>
+            </w:r>
+            <w:r>
+              <w:t xml:space="preserve">, </w:t>
+            </w:r>
+            <w:r>
+              <w:rPr>
+                <w:rFonts w:ascii="Consolas" w:hAnsi="Consolas"/>
+                <w:sz w:val="20"/>
+              </w:rPr>
+              <w:t>trigger_airflow_dag</w:t>
+            </w:r>
+            <w:r>
+              <w:t xml:space="preserve">, </w:t>
+            </w:r>
+            <w:r>
+              <w:rPr>
+                <w:rFonts w:ascii="Consolas" w:hAnsi="Consolas"/>
+                <w:sz w:val="20"/>
+              </w:rPr>
+              <w:t>run_sql</w:t>
+            </w:r>
+            <w:r>
+              <w:t xml:space="preserve">, </w:t>
+            </w:r>
+            <w:r>
+              <w:rPr>
+                <w:rFonts w:ascii="Consolas" w:hAnsi="Consolas"/>
+                <w:sz w:val="20"/>
+              </w:rPr>
+              <w:t>get_contract_summary</w:t>
+            </w:r>
+          </w:p>
+        </w:tc>
+      </w:tr>
+      <w:tr>
+        <w:tc>
+          <w:tcPr>
+            <w:tcW w:type="dxa" w:w="2880"/>
+            <w:vAlign w:val="center"/>
+          </w:tcPr>
+          <w:p>
+            <w:r/>
+            <w:r>
+              <w:t>8</w:t>
+            </w:r>
+          </w:p>
+        </w:tc>
+        <w:tc>
+          <w:tcPr>
+            <w:tcW w:type="dxa" w:w="2880"/>
+            <w:vAlign w:val="center"/>
+          </w:tcPr>
+          <w:p>
+            <w:r/>
+            <w:r>
+              <w:t>Memory Architecture</w:t>
+            </w:r>
+          </w:p>
+        </w:tc>
+        <w:tc>
+          <w:tcPr>
+            <w:tcW w:type="dxa" w:w="2880"/>
+            <w:vAlign w:val="center"/>
+          </w:tcPr>
+          <w:p>
+            <w:r/>
+            <w:r>
+              <w:rPr>
+                <w:b/>
+              </w:rPr>
+              <w:t>IMPLEMENTED</w:t>
+            </w:r>
+            <w:r>
+              <w:t xml:space="preserve"> — in-memory session dict in </w:t>
+            </w:r>
+            <w:r>
+              <w:rPr>
+                <w:rFonts w:ascii="Consolas" w:hAnsi="Consolas"/>
+                <w:sz w:val="20"/>
+              </w:rPr>
+              <w:t>backend/main.py</w:t>
+            </w:r>
+          </w:p>
+        </w:tc>
+      </w:tr>
+      <w:tr>
+        <w:tc>
+          <w:tcPr>
+            <w:tcW w:type="dxa" w:w="2880"/>
+            <w:vAlign w:val="center"/>
+          </w:tcPr>
+          <w:p>
+            <w:r/>
+            <w:r>
+              <w:t>9</w:t>
+            </w:r>
+          </w:p>
+        </w:tc>
+        <w:tc>
+          <w:tcPr>
+            <w:tcW w:type="dxa" w:w="2880"/>
+            <w:vAlign w:val="center"/>
+          </w:tcPr>
+          <w:p>
+            <w:r/>
+            <w:r>
+              <w:t>RAG</w:t>
+            </w:r>
+          </w:p>
+        </w:tc>
+        <w:tc>
+          <w:tcPr>
+            <w:tcW w:type="dxa" w:w="2880"/>
+            <w:vAlign w:val="center"/>
+          </w:tcPr>
+          <w:p>
+            <w:r/>
+            <w:r>
+              <w:rPr>
+                <w:b/>
+              </w:rPr>
+              <w:t>PARTIAL</w:t>
+            </w:r>
+            <w:r>
+              <w:t xml:space="preserve"> — structured SQL retrieval exists; no embeddings</w:t>
+            </w:r>
+          </w:p>
+        </w:tc>
+      </w:tr>
+      <w:tr>
+        <w:tc>
+          <w:tcPr>
+            <w:tcW w:type="dxa" w:w="2880"/>
+            <w:vAlign w:val="center"/>
+          </w:tcPr>
+          <w:p>
+            <w:r/>
+            <w:r>
+              <w:t>10</w:t>
+            </w:r>
+          </w:p>
+        </w:tc>
+        <w:tc>
+          <w:tcPr>
+            <w:tcW w:type="dxa" w:w="2880"/>
+            <w:vAlign w:val="center"/>
+          </w:tcPr>
+          <w:p>
+            <w:r/>
+            <w:r>
+              <w:t>Orchestration &amp; Control Flow</w:t>
+            </w:r>
+          </w:p>
+        </w:tc>
+        <w:tc>
+          <w:tcPr>
+            <w:tcW w:type="dxa" w:w="2880"/>
+            <w:vAlign w:val="center"/>
+          </w:tcPr>
+          <w:p>
+            <w:r/>
+            <w:r>
+              <w:rPr>
+                <w:b/>
+              </w:rPr>
+              <w:t>PARTIAL</w:t>
+            </w:r>
+            <w:r>
+              <w:t xml:space="preserve"> — step-based state machine in </w:t>
+            </w:r>
+            <w:r>
+              <w:rPr>
+                <w:rFonts w:ascii="Consolas" w:hAnsi="Consolas"/>
+                <w:sz w:val="20"/>
+              </w:rPr>
+              <w:t>backend/main.py</w:t>
+            </w:r>
+            <w:r>
+              <w:t>; not the LangGraph StateGraph diagrammed</w:t>
+            </w:r>
+          </w:p>
+        </w:tc>
+      </w:tr>
+      <w:tr>
+        <w:tc>
+          <w:tcPr>
+            <w:tcW w:type="dxa" w:w="2880"/>
+            <w:vAlign w:val="center"/>
+          </w:tcPr>
+          <w:p>
+            <w:r/>
+            <w:r>
+              <w:t>11</w:t>
+            </w:r>
+          </w:p>
+        </w:tc>
+        <w:tc>
+          <w:tcPr>
+            <w:tcW w:type="dxa" w:w="2880"/>
+            <w:vAlign w:val="center"/>
+          </w:tcPr>
+          <w:p>
+            <w:r/>
+            <w:r>
+              <w:t>Conversation Design &amp; State</w:t>
+            </w:r>
+          </w:p>
+        </w:tc>
+        <w:tc>
+          <w:tcPr>
+            <w:tcW w:type="dxa" w:w="2880"/>
+            <w:vAlign w:val="center"/>
+          </w:tcPr>
+          <w:p>
+            <w:r/>
+            <w:r>
+              <w:rPr>
+                <w:b/>
+              </w:rPr>
+              <w:t>IMPLEMENTED</w:t>
+            </w:r>
+            <w:r>
+              <w:t xml:space="preserve"> — session-scoped history; no persistence</w:t>
+            </w:r>
+          </w:p>
+        </w:tc>
+      </w:tr>
+      <w:tr>
+        <w:tc>
+          <w:tcPr>
+            <w:tcW w:type="dxa" w:w="2880"/>
+            <w:vAlign w:val="center"/>
+          </w:tcPr>
+          <w:p>
+            <w:r/>
+            <w:r>
+              <w:t>12</w:t>
+            </w:r>
+          </w:p>
+        </w:tc>
+        <w:tc>
+          <w:tcPr>
+            <w:tcW w:type="dxa" w:w="2880"/>
+            <w:vAlign w:val="center"/>
+          </w:tcPr>
+          <w:p>
+            <w:r/>
+            <w:r>
+              <w:t>Frontend Architecture</w:t>
+            </w:r>
+          </w:p>
+        </w:tc>
+        <w:tc>
+          <w:tcPr>
+            <w:tcW w:type="dxa" w:w="2880"/>
+            <w:vAlign w:val="center"/>
+          </w:tcPr>
+          <w:p>
+            <w:r/>
+            <w:r>
+              <w:rPr>
+                <w:b/>
+              </w:rPr>
+              <w:t>IMPLEMENTED</w:t>
+            </w:r>
+            <w:r>
+              <w:t xml:space="preserve"> — React 18 + Vite 5, 3 panels, Markdown renderer</w:t>
+            </w:r>
+          </w:p>
+        </w:tc>
+      </w:tr>
+      <w:tr>
+        <w:tc>
+          <w:tcPr>
+            <w:tcW w:type="dxa" w:w="2880"/>
+            <w:vAlign w:val="center"/>
+          </w:tcPr>
+          <w:p>
+            <w:r/>
+            <w:r>
+              <w:t>13</w:t>
+            </w:r>
+          </w:p>
+        </w:tc>
+        <w:tc>
+          <w:tcPr>
+            <w:tcW w:type="dxa" w:w="2880"/>
+            <w:vAlign w:val="center"/>
+          </w:tcPr>
+          <w:p>
+            <w:r/>
+            <w:r>
+              <w:t>Backend Services</w:t>
+            </w:r>
+          </w:p>
+        </w:tc>
+        <w:tc>
+          <w:tcPr>
+            <w:tcW w:type="dxa" w:w="2880"/>
+            <w:vAlign w:val="center"/>
+          </w:tcPr>
+          <w:p>
+            <w:r/>
+            <w:r>
+              <w:rPr>
+                <w:b/>
+              </w:rPr>
+              <w:t>IMPLEMENTED</w:t>
+            </w:r>
+            <w:r>
+              <w:t xml:space="preserve"> — modular monolith: </w:t>
+            </w:r>
+            <w:r>
+              <w:rPr>
+                <w:rFonts w:ascii="Consolas" w:hAnsi="Consolas"/>
+                <w:sz w:val="20"/>
+              </w:rPr>
+              <w:t>main.py</w:t>
+            </w:r>
+            <w:r>
+              <w:t xml:space="preserve">, </w:t>
+            </w:r>
+            <w:r>
+              <w:rPr>
+                <w:rFonts w:ascii="Consolas" w:hAnsi="Consolas"/>
+                <w:sz w:val="20"/>
+              </w:rPr>
+              <w:t>database.py</w:t>
+            </w:r>
+            <w:r>
+              <w:t xml:space="preserve">, </w:t>
+            </w:r>
+            <w:r>
+              <w:rPr>
+                <w:rFonts w:ascii="Consolas" w:hAnsi="Consolas"/>
+                <w:sz w:val="20"/>
+              </w:rPr>
+              <w:t>llm_service.py</w:t>
+            </w:r>
+          </w:p>
+        </w:tc>
+      </w:tr>
+      <w:tr>
+        <w:tc>
+          <w:tcPr>
+            <w:tcW w:type="dxa" w:w="2880"/>
+            <w:vAlign w:val="center"/>
+          </w:tcPr>
+          <w:p>
+            <w:r/>
+            <w:r>
+              <w:t>14</w:t>
+            </w:r>
+          </w:p>
+        </w:tc>
+        <w:tc>
+          <w:tcPr>
+            <w:tcW w:type="dxa" w:w="2880"/>
+            <w:vAlign w:val="center"/>
+          </w:tcPr>
+          <w:p>
+            <w:r/>
+            <w:r>
+              <w:t>Streaming &amp; Real-Time</w:t>
+            </w:r>
+          </w:p>
+        </w:tc>
+        <w:tc>
+          <w:tcPr>
+            <w:tcW w:type="dxa" w:w="2880"/>
+            <w:vAlign w:val="center"/>
+          </w:tcPr>
+          <w:p>
+            <w:r/>
+            <w:r>
+              <w:rPr>
+                <w:b/>
+              </w:rPr>
+              <w:t>IMPLEMENTED</w:t>
+            </w:r>
+            <w:r>
+              <w:t xml:space="preserve"> — 30-second polling in StatusMonitorPanel; no SSE/WebSocket</w:t>
+            </w:r>
+          </w:p>
+        </w:tc>
+      </w:tr>
+      <w:tr>
+        <w:tc>
+          <w:tcPr>
+            <w:tcW w:type="dxa" w:w="2880"/>
+            <w:vAlign w:val="center"/>
+          </w:tcPr>
+          <w:p>
+            <w:r/>
+            <w:r>
+              <w:t>15</w:t>
+            </w:r>
+          </w:p>
+        </w:tc>
+        <w:tc>
+          <w:tcPr>
+            <w:tcW w:type="dxa" w:w="2880"/>
+            <w:vAlign w:val="center"/>
+          </w:tcPr>
+          <w:p>
+            <w:r/>
+            <w:r>
+              <w:t>Full-Stack Integration</w:t>
+            </w:r>
+          </w:p>
+        </w:tc>
+        <w:tc>
+          <w:tcPr>
+            <w:tcW w:type="dxa" w:w="2880"/>
+            <w:vAlign w:val="center"/>
+          </w:tcPr>
+          <w:p>
+            <w:r/>
+            <w:r>
+              <w:rPr>
+                <w:b/>
+              </w:rPr>
+              <w:t>IMPLEMENTED</w:t>
+            </w:r>
+            <w:r>
+              <w:t xml:space="preserve"> — REST over JSON; Vite proxy </w:t>
+            </w:r>
+            <w:r>
+              <w:rPr>
+                <w:rFonts w:ascii="Consolas" w:hAnsi="Consolas"/>
+                <w:sz w:val="20"/>
+              </w:rPr>
+              <w:t>/api</w:t>
+            </w:r>
+            <w:r>
+              <w:t xml:space="preserve"> → </w:t>
+            </w:r>
+            <w:r>
+              <w:rPr>
+                <w:rFonts w:ascii="Consolas" w:hAnsi="Consolas"/>
+                <w:sz w:val="20"/>
+              </w:rPr>
+              <w:t>localhost:8000</w:t>
+            </w:r>
+          </w:p>
+        </w:tc>
+      </w:tr>
+      <w:tr>
+        <w:tc>
+          <w:tcPr>
+            <w:tcW w:type="dxa" w:w="2880"/>
+            <w:vAlign w:val="center"/>
+          </w:tcPr>
+          <w:p>
+            <w:r/>
+            <w:r>
+              <w:t>16</w:t>
+            </w:r>
+          </w:p>
+        </w:tc>
+        <w:tc>
+          <w:tcPr>
+            <w:tcW w:type="dxa" w:w="2880"/>
+            <w:vAlign w:val="center"/>
+          </w:tcPr>
+          <w:p>
+            <w:r/>
+            <w:r>
+              <w:t>Auth, Authz &amp; Sessions</w:t>
+            </w:r>
+          </w:p>
+        </w:tc>
+        <w:tc>
+          <w:tcPr>
+            <w:tcW w:type="dxa" w:w="2880"/>
+            <w:vAlign w:val="center"/>
+          </w:tcPr>
+          <w:p>
+            <w:r/>
+            <w:r>
+              <w:rPr>
+                <w:b/>
+              </w:rPr>
+              <w:t>PARTIAL</w:t>
+            </w:r>
+            <w:r>
+              <w:t xml:space="preserve"> — session IDs exist; SSO/RBAC/audit log </w:t>
+            </w:r>
+            <w:r>
+              <w:rPr>
+                <w:b/>
+              </w:rPr>
+              <w:t>TARGET STATE</w:t>
+            </w:r>
+          </w:p>
+        </w:tc>
+      </w:tr>
+      <w:tr>
+        <w:tc>
+          <w:tcPr>
+            <w:tcW w:type="dxa" w:w="2880"/>
+            <w:vAlign w:val="center"/>
+          </w:tcPr>
+          <w:p>
+            <w:r/>
+            <w:r>
+              <w:t>17</w:t>
+            </w:r>
+          </w:p>
+        </w:tc>
+        <w:tc>
+          <w:tcPr>
+            <w:tcW w:type="dxa" w:w="2880"/>
+            <w:vAlign w:val="center"/>
+          </w:tcPr>
+          <w:p>
+            <w:r/>
+            <w:r>
+              <w:t>Guardrails &amp; Alignment</w:t>
+            </w:r>
+          </w:p>
+        </w:tc>
+        <w:tc>
+          <w:tcPr>
+            <w:tcW w:type="dxa" w:w="2880"/>
+            <w:vAlign w:val="center"/>
+          </w:tcPr>
+          <w:p>
+            <w:r/>
+            <w:r>
+              <w:rPr>
+                <w:b/>
+              </w:rPr>
+              <w:t>TARGET STATE</w:t>
+            </w:r>
+            <w:r>
+              <w:t xml:space="preserve"> — no input filter, no output filter, no policy layer in code today</w:t>
+            </w:r>
+          </w:p>
+        </w:tc>
+      </w:tr>
+      <w:tr>
+        <w:tc>
+          <w:tcPr>
+            <w:tcW w:type="dxa" w:w="2880"/>
+            <w:vAlign w:val="center"/>
+          </w:tcPr>
+          <w:p>
+            <w:r/>
+            <w:r>
+              <w:t>18</w:t>
+            </w:r>
+          </w:p>
+        </w:tc>
+        <w:tc>
+          <w:tcPr>
+            <w:tcW w:type="dxa" w:w="2880"/>
+            <w:vAlign w:val="center"/>
+          </w:tcPr>
+          <w:p>
+            <w:r/>
+            <w:r>
+              <w:t>Threat Modeling &amp; Defense</w:t>
+            </w:r>
+          </w:p>
+        </w:tc>
+        <w:tc>
+          <w:tcPr>
+            <w:tcW w:type="dxa" w:w="2880"/>
+            <w:vAlign w:val="center"/>
+          </w:tcPr>
+          <w:p>
+            <w:r/>
+            <w:r>
+              <w:rPr>
+                <w:b/>
+              </w:rPr>
+              <w:t>TARGET STATE</w:t>
+            </w:r>
+            <w:r>
+              <w:t xml:space="preserve"> — threat model documented; prompt-injection defenses, circuit breakers, secrets vaulting not yet coded</w:t>
+            </w:r>
+          </w:p>
+        </w:tc>
+      </w:tr>
+      <w:tr>
+        <w:tc>
+          <w:tcPr>
+            <w:tcW w:type="dxa" w:w="2880"/>
+            <w:vAlign w:val="center"/>
+          </w:tcPr>
+          <w:p>
+            <w:r/>
+            <w:r>
+              <w:t>19</w:t>
+            </w:r>
+          </w:p>
+        </w:tc>
+        <w:tc>
+          <w:tcPr>
+            <w:tcW w:type="dxa" w:w="2880"/>
+            <w:vAlign w:val="center"/>
+          </w:tcPr>
+          <w:p>
+            <w:r/>
+            <w:r>
+              <w:t>UX &amp; Interaction Design</w:t>
+            </w:r>
+          </w:p>
+        </w:tc>
+        <w:tc>
+          <w:tcPr>
+            <w:tcW w:type="dxa" w:w="2880"/>
+            <w:vAlign w:val="center"/>
+          </w:tcPr>
+          <w:p>
+            <w:r/>
+            <w:r>
+              <w:rPr>
+                <w:b/>
+              </w:rPr>
+              <w:t>PARTIAL</w:t>
+            </w:r>
+            <w:r>
+              <w:t xml:space="preserve"> — core UX shipped; thumbs-up/down feedback </w:t>
+            </w:r>
+            <w:r>
+              <w:rPr>
+                <w:b/>
+              </w:rPr>
+              <w:t>TARGET STATE</w:t>
+            </w:r>
+          </w:p>
+        </w:tc>
+      </w:tr>
+      <w:tr>
+        <w:tc>
+          <w:tcPr>
+            <w:tcW w:type="dxa" w:w="2880"/>
+            <w:vAlign w:val="center"/>
+          </w:tcPr>
+          <w:p>
+            <w:r/>
+            <w:r>
+              <w:t>20</w:t>
+            </w:r>
+          </w:p>
+        </w:tc>
+        <w:tc>
+          <w:tcPr>
+            <w:tcW w:type="dxa" w:w="2880"/>
+            <w:vAlign w:val="center"/>
+          </w:tcPr>
+          <w:p>
+            <w:r/>
+            <w:r>
+              <w:t>Testing Strategy</w:t>
+            </w:r>
+          </w:p>
+        </w:tc>
+        <w:tc>
+          <w:tcPr>
+            <w:tcW w:type="dxa" w:w="2880"/>
+            <w:vAlign w:val="center"/>
+          </w:tcPr>
+          <w:p>
+            <w:r/>
+            <w:r>
+              <w:rPr>
+                <w:b/>
+              </w:rPr>
+              <w:t>TARGET STATE</w:t>
+            </w:r>
+            <w:r>
+              <w:t xml:space="preserve"> — no test files, no eval suites, no CI checks in repo today</w:t>
+            </w:r>
+          </w:p>
+        </w:tc>
+      </w:tr>
+      <w:tr>
+        <w:tc>
+          <w:tcPr>
+            <w:tcW w:type="dxa" w:w="2880"/>
+            <w:vAlign w:val="center"/>
+          </w:tcPr>
+          <w:p>
+            <w:r/>
+            <w:r>
+              <w:t>21</w:t>
+            </w:r>
+          </w:p>
+        </w:tc>
+        <w:tc>
+          <w:tcPr>
+            <w:tcW w:type="dxa" w:w="2880"/>
+            <w:vAlign w:val="center"/>
+          </w:tcPr>
+          <w:p>
+            <w:r/>
+            <w:r>
+              <w:t>Observability &amp; Monitoring</w:t>
+            </w:r>
+          </w:p>
+        </w:tc>
+        <w:tc>
+          <w:tcPr>
+            <w:tcW w:type="dxa" w:w="2880"/>
+            <w:vAlign w:val="center"/>
+          </w:tcPr>
+          <w:p>
+            <w:r/>
+            <w:r>
+              <w:rPr>
+                <w:b/>
+              </w:rPr>
+              <w:t>PARTIAL</w:t>
+            </w:r>
+            <w:r>
+              <w:t xml:space="preserve"> — basic Python logging only; Prometheus/Grafana/alerts </w:t>
+            </w:r>
+            <w:r>
+              <w:rPr>
+                <w:b/>
+              </w:rPr>
+              <w:t>TARGET STATE</w:t>
+            </w:r>
+          </w:p>
+        </w:tc>
+      </w:tr>
+      <w:tr>
+        <w:tc>
+          <w:tcPr>
+            <w:tcW w:type="dxa" w:w="2880"/>
+            <w:vAlign w:val="center"/>
+          </w:tcPr>
+          <w:p>
+            <w:r/>
+            <w:r>
+              <w:t>22</w:t>
+            </w:r>
+          </w:p>
+        </w:tc>
+        <w:tc>
+          <w:tcPr>
+            <w:tcW w:type="dxa" w:w="2880"/>
+            <w:vAlign w:val="center"/>
+          </w:tcPr>
+          <w:p>
+            <w:r/>
+            <w:r>
+              <w:t>Cost Management</w:t>
+            </w:r>
+          </w:p>
+        </w:tc>
+        <w:tc>
+          <w:tcPr>
+            <w:tcW w:type="dxa" w:w="2880"/>
+            <w:vAlign w:val="center"/>
+          </w:tcPr>
+          <w:p>
+            <w:r/>
+            <w:r>
+              <w:rPr>
+                <w:b/>
+              </w:rPr>
+              <w:t>TARGET STATE</w:t>
+            </w:r>
+            <w:r>
+              <w:t xml:space="preserve"> — no cost metering or caching layers coded yet</w:t>
+            </w:r>
+          </w:p>
+        </w:tc>
+      </w:tr>
+      <w:tr>
+        <w:tc>
+          <w:tcPr>
+            <w:tcW w:type="dxa" w:w="2880"/>
+            <w:vAlign w:val="center"/>
+          </w:tcPr>
+          <w:p>
+            <w:r/>
+            <w:r>
+              <w:t>23</w:t>
+            </w:r>
+          </w:p>
+        </w:tc>
+        <w:tc>
+          <w:tcPr>
+            <w:tcW w:type="dxa" w:w="2880"/>
+            <w:vAlign w:val="center"/>
+          </w:tcPr>
+          <w:p>
+            <w:r/>
+            <w:r>
+              <w:t>API Design &amp; Contracts</w:t>
+            </w:r>
+          </w:p>
+        </w:tc>
+        <w:tc>
+          <w:tcPr>
+            <w:tcW w:type="dxa" w:w="2880"/>
+            <w:vAlign w:val="center"/>
+          </w:tcPr>
+          <w:p>
+            <w:r/>
+            <w:r>
+              <w:rPr>
+                <w:b/>
+              </w:rPr>
+              <w:t>PARTIAL</w:t>
+            </w:r>
+            <w:r>
+              <w:t xml:space="preserve"> — REST endpoints exist; versioning/rate-limit/OpenAPI usage </w:t>
+            </w:r>
+            <w:r>
+              <w:rPr>
+                <w:b/>
+              </w:rPr>
+              <w:t>TARGET STATE</w:t>
+            </w:r>
+          </w:p>
+        </w:tc>
+      </w:tr>
+      <w:tr>
+        <w:tc>
+          <w:tcPr>
+            <w:tcW w:type="dxa" w:w="2880"/>
+            <w:vAlign w:val="center"/>
+          </w:tcPr>
+          <w:p>
+            <w:r/>
+            <w:r>
+              <w:t>24</w:t>
+            </w:r>
+          </w:p>
+        </w:tc>
+        <w:tc>
+          <w:tcPr>
+            <w:tcW w:type="dxa" w:w="2880"/>
+            <w:vAlign w:val="center"/>
+          </w:tcPr>
+          <w:p>
+            <w:r/>
+            <w:r>
+              <w:t>Data Architecture &amp; Storage</w:t>
+            </w:r>
+          </w:p>
+        </w:tc>
+        <w:tc>
+          <w:tcPr>
+            <w:tcW w:type="dxa" w:w="2880"/>
+            <w:vAlign w:val="center"/>
+          </w:tcPr>
+          <w:p>
+            <w:r/>
+            <w:r>
+              <w:rPr>
+                <w:b/>
+              </w:rPr>
+              <w:t>PARTIAL</w:t>
+            </w:r>
+            <w:r>
+              <w:t xml:space="preserve"> — tables exist (</w:t>
+            </w:r>
+            <w:r>
+              <w:rPr>
+                <w:rFonts w:ascii="Consolas" w:hAnsi="Consolas"/>
+                <w:sz w:val="20"/>
+              </w:rPr>
+              <w:t>admin_fee_metadata</w:t>
+            </w:r>
+            <w:r>
+              <w:t xml:space="preserve">, </w:t>
+            </w:r>
+            <w:r>
+              <w:rPr>
+                <w:rFonts w:ascii="Consolas" w:hAnsi="Consolas"/>
+                <w:sz w:val="20"/>
+              </w:rPr>
+              <w:t>adminfee_audit_data</w:t>
+            </w:r>
+            <w:r>
+              <w:t xml:space="preserve">); agent audit log </w:t>
+            </w:r>
+            <w:r>
+              <w:rPr>
+                <w:b/>
+              </w:rPr>
+              <w:t>TARGET STATE</w:t>
+            </w:r>
+          </w:p>
+        </w:tc>
+      </w:tr>
+      <w:tr>
+        <w:tc>
+          <w:tcPr>
+            <w:tcW w:type="dxa" w:w="2880"/>
+            <w:vAlign w:val="center"/>
+          </w:tcPr>
+          <w:p>
+            <w:r/>
+            <w:r>
+              <w:t>25</w:t>
+            </w:r>
+          </w:p>
+        </w:tc>
+        <w:tc>
+          <w:tcPr>
+            <w:tcW w:type="dxa" w:w="2880"/>
+            <w:vAlign w:val="center"/>
+          </w:tcPr>
+          <w:p>
+            <w:r/>
+            <w:r>
+              <w:t>Deployment &amp; Infrastructure</w:t>
+            </w:r>
+          </w:p>
+        </w:tc>
+        <w:tc>
+          <w:tcPr>
+            <w:tcW w:type="dxa" w:w="2880"/>
+            <w:vAlign w:val="center"/>
+          </w:tcPr>
+          <w:p>
+            <w:r/>
+            <w:r>
+              <w:rPr>
+                <w:b/>
+              </w:rPr>
+              <w:t>TARGET STATE</w:t>
+            </w:r>
+            <w:r>
+              <w:t xml:space="preserve"> — no CI/CD, no Terraform, no containers in repo today</w:t>
+            </w:r>
+          </w:p>
+        </w:tc>
+      </w:tr>
+      <w:tr>
+        <w:tc>
+          <w:tcPr>
+            <w:tcW w:type="dxa" w:w="2880"/>
+            <w:vAlign w:val="center"/>
+          </w:tcPr>
+          <w:p>
+            <w:r/>
+            <w:r>
+              <w:t>26</w:t>
+            </w:r>
+          </w:p>
+        </w:tc>
+        <w:tc>
+          <w:tcPr>
+            <w:tcW w:type="dxa" w:w="2880"/>
+            <w:vAlign w:val="center"/>
+          </w:tcPr>
+          <w:p>
+            <w:r/>
+            <w:r>
+              <w:t>Reliability &amp; Resilience</w:t>
+            </w:r>
+          </w:p>
+        </w:tc>
+        <w:tc>
+          <w:tcPr>
+            <w:tcW w:type="dxa" w:w="2880"/>
+            <w:vAlign w:val="center"/>
+          </w:tcPr>
+          <w:p>
+            <w:r/>
+            <w:r>
+              <w:rPr>
+                <w:b/>
+              </w:rPr>
+              <w:t>TARGET STATE</w:t>
+            </w:r>
+            <w:r>
+              <w:t xml:space="preserve"> — no SLOs, circuit breakers, DR runbook in code</w:t>
+            </w:r>
+          </w:p>
+        </w:tc>
+      </w:tr>
+      <w:tr>
+        <w:tc>
+          <w:tcPr>
+            <w:tcW w:type="dxa" w:w="2880"/>
+            <w:vAlign w:val="center"/>
+          </w:tcPr>
+          <w:p>
+            <w:r/>
+            <w:r>
+              <w:t>27</w:t>
+            </w:r>
+          </w:p>
+        </w:tc>
+        <w:tc>
+          <w:tcPr>
+            <w:tcW w:type="dxa" w:w="2880"/>
+            <w:vAlign w:val="center"/>
+          </w:tcPr>
+          <w:p>
+            <w:r/>
+            <w:r>
+              <w:t>Versioning &amp; Roadmap</w:t>
+            </w:r>
+          </w:p>
+        </w:tc>
+        <w:tc>
+          <w:tcPr>
+            <w:tcW w:type="dxa" w:w="2880"/>
+            <w:vAlign w:val="center"/>
+          </w:tcPr>
+          <w:p>
+            <w:r/>
+            <w:r>
+              <w:rPr>
+                <w:b/>
+              </w:rPr>
+              <w:t>TARGET STATE</w:t>
+            </w:r>
+            <w:r>
+              <w:t xml:space="preserve"> — no SemVer tags, no ADRs written yet</w:t>
+            </w:r>
+          </w:p>
+        </w:tc>
+      </w:tr>
+      <w:tr>
+        <w:tc>
+          <w:tcPr>
+            <w:tcW w:type="dxa" w:w="2880"/>
+            <w:vAlign w:val="center"/>
+          </w:tcPr>
+          <w:p>
+            <w:r/>
+            <w:r>
+              <w:t>28</w:t>
+            </w:r>
+          </w:p>
+        </w:tc>
+        <w:tc>
+          <w:tcPr>
+            <w:tcW w:type="dxa" w:w="2880"/>
+            <w:vAlign w:val="center"/>
+          </w:tcPr>
+          <w:p>
+            <w:r/>
+            <w:r>
+              <w:t>Reference Appendix</w:t>
+            </w:r>
+          </w:p>
+        </w:tc>
+        <w:tc>
+          <w:tcPr>
+            <w:tcW w:type="dxa" w:w="2880"/>
+            <w:vAlign w:val="center"/>
+          </w:tcPr>
+          <w:p>
+            <w:r/>
+            <w:r>
+              <w:rPr>
+                <w:b/>
+              </w:rPr>
+              <w:t>IMPLEMENTED</w:t>
+            </w:r>
+            <w:r>
+              <w:t xml:space="preserve"> — glossary and references accurate</w:t>
+            </w:r>
+          </w:p>
+        </w:tc>
+      </w:tr>
+    </w:tbl>
+    <w:p/>
+    <w:p>
+      <w:pPr>
+        <w:ind w:left="432"/>
+      </w:pPr>
+      <w:r>
+        <w:rPr>
+          <w:i/>
+          <w:color w:val="595959"/>
+        </w:rPr>
+        <w:t>**How to read this document**: If a subsection is labeled **IMPLEMENTED** or **PARTIAL**, the described behavior (in full or in part) exists in the code. If labeled **TARGET STATE**, treat it as the design intent to build against — it is NOT present today.</w:t>
+      </w:r>
+    </w:p>
+    <w:p>
+      <w:pPr>
+        <w:pStyle w:val="Heading1"/>
+      </w:pPr>
+      <w:r>
+        <w:rPr>
+          <w:color w:val="1F4E79"/>
+        </w:rPr>
+        <w:t>Known Deviations from As-Built Code</w:t>
+      </w:r>
+    </w:p>
+    <w:p>
+      <w:r>
+        <w:t>Explicit corrections where the design document aspires differently than what is shipped:</w:t>
+      </w:r>
+    </w:p>
+    <w:tbl>
+      <w:tblPr>
+        <w:tblStyle w:val="LightGrid-Accent1"/>
+        <w:tblW w:type="auto" w:w="0"/>
+        <w:tblLook w:firstColumn="1" w:firstRow="1" w:lastColumn="0" w:lastRow="0" w:noHBand="0" w:noVBand="1" w:val="04A0"/>
+      </w:tblPr>
+      <w:tblGrid>
+        <w:gridCol w:w="2880"/>
+        <w:gridCol w:w="2880"/>
+        <w:gridCol w:w="2880"/>
+      </w:tblGrid>
+      <w:tr>
+        <w:tc>
+          <w:tcPr>
+            <w:tcW w:type="dxa" w:w="2880"/>
+            <w:shd w:fill="1F4E79"/>
+            <w:vAlign w:val="center"/>
+          </w:tcPr>
+          <w:p>
+            <w:r>
+              <w:rPr>
+                <w:b/>
+                <w:color w:val="FFFFFF"/>
+              </w:rPr>
+            </w:r>
+            <w:r>
+              <w:rPr>
+                <w:b/>
+                <w:color w:val="FFFFFF"/>
+              </w:rPr>
+              <w:t>Design claim</w:t>
+            </w:r>
+          </w:p>
+        </w:tc>
+        <w:tc>
+          <w:tcPr>
+            <w:tcW w:type="dxa" w:w="2880"/>
+            <w:shd w:fill="1F4E79"/>
+            <w:vAlign w:val="center"/>
+          </w:tcPr>
+          <w:p>
+            <w:r>
+              <w:rPr>
+                <w:b/>
+                <w:color w:val="FFFFFF"/>
+              </w:rPr>
+            </w:r>
+            <w:r>
+              <w:rPr>
+                <w:b/>
+                <w:color w:val="FFFFFF"/>
+              </w:rPr>
+              <w:t>Actual code today</w:t>
+            </w:r>
+          </w:p>
+        </w:tc>
+        <w:tc>
+          <w:tcPr>
+            <w:tcW w:type="dxa" w:w="2880"/>
+            <w:shd w:fill="1F4E79"/>
+            <w:vAlign w:val="center"/>
+          </w:tcPr>
+          <w:p>
+            <w:r>
+              <w:rPr>
+                <w:b/>
+                <w:color w:val="FFFFFF"/>
+              </w:rPr>
+            </w:r>
+            <w:r>
+              <w:rPr>
+                <w:b/>
+                <w:color w:val="FFFFFF"/>
+              </w:rPr>
+              <w:t>Path forward</w:t>
+            </w:r>
+          </w:p>
+        </w:tc>
+      </w:tr>
+      <w:tr>
+        <w:tc>
+          <w:tcPr>
+            <w:tcW w:type="dxa" w:w="2880"/>
+            <w:vAlign w:val="center"/>
+          </w:tcPr>
+          <w:p>
+            <w:r/>
+            <w:r>
+              <w:t>LLaMA 3.1 8B (on-prem / Bedrock)</w:t>
+            </w:r>
+          </w:p>
+        </w:tc>
+        <w:tc>
+          <w:tcPr>
+            <w:tcW w:type="dxa" w:w="2880"/>
+            <w:vAlign w:val="center"/>
+          </w:tcPr>
+          <w:p>
+            <w:r/>
+            <w:r>
+              <w:t xml:space="preserve">OpenAI </w:t>
+            </w:r>
+            <w:r>
+              <w:rPr>
+                <w:rFonts w:ascii="Consolas" w:hAnsi="Consolas"/>
+                <w:sz w:val="20"/>
+              </w:rPr>
+              <w:t>gpt-4.1-mini</w:t>
+            </w:r>
+            <w:r>
+              <w:t xml:space="preserve"> via LangChain </w:t>
+            </w:r>
+            <w:r>
+              <w:rPr>
+                <w:rFonts w:ascii="Consolas" w:hAnsi="Consolas"/>
+                <w:sz w:val="20"/>
+              </w:rPr>
+              <w:t>ChatOpenAI</w:t>
+            </w:r>
+          </w:p>
+        </w:tc>
+        <w:tc>
+          <w:tcPr>
+            <w:tcW w:type="dxa" w:w="2880"/>
+            <w:vAlign w:val="center"/>
+          </w:tcPr>
+          <w:p>
+            <w:r/>
+            <w:r>
+              <w:t>Planned swap; track as ADR-003</w:t>
+            </w:r>
+          </w:p>
+        </w:tc>
+      </w:tr>
+      <w:tr>
+        <w:tc>
+          <w:tcPr>
+            <w:tcW w:type="dxa" w:w="2880"/>
+            <w:vAlign w:val="center"/>
+          </w:tcPr>
+          <w:p>
+            <w:r/>
+            <w:r>
+              <w:t>LangGraph StateGraph in web backend</w:t>
+            </w:r>
+          </w:p>
+        </w:tc>
+        <w:tc>
+          <w:tcPr>
+            <w:tcW w:type="dxa" w:w="2880"/>
+            <w:vAlign w:val="center"/>
+          </w:tcPr>
+          <w:p>
+            <w:r/>
+            <w:r>
+              <w:t xml:space="preserve">Dict-based step machine in </w:t>
+            </w:r>
+            <w:r>
+              <w:rPr>
+                <w:rFonts w:ascii="Consolas" w:hAnsi="Consolas"/>
+                <w:sz w:val="20"/>
+              </w:rPr>
+              <w:t>backend/main.py</w:t>
+            </w:r>
+            <w:r>
+              <w:t xml:space="preserve"> (LangGraph lives only in legacy CLI scripts)</w:t>
+            </w:r>
+          </w:p>
+        </w:tc>
+        <w:tc>
+          <w:tcPr>
+            <w:tcW w:type="dxa" w:w="2880"/>
+            <w:vAlign w:val="center"/>
+          </w:tcPr>
+          <w:p>
+            <w:r/>
+            <w:r>
+              <w:t>Migrate web flow to LangGraph; track as follow-up ADR</w:t>
+            </w:r>
+          </w:p>
+        </w:tc>
+      </w:tr>
+      <w:tr>
+        <w:tc>
+          <w:tcPr>
+            <w:tcW w:type="dxa" w:w="2880"/>
+            <w:vAlign w:val="center"/>
+          </w:tcPr>
+          <w:p>
+            <w:r/>
+            <w:r>
+              <w:t xml:space="preserve">Delivery IDs like </w:t>
+            </w:r>
+            <w:r>
+              <w:rPr>
+                <w:rFonts w:ascii="Consolas" w:hAnsi="Consolas"/>
+                <w:sz w:val="20"/>
+              </w:rPr>
+              <w:t>VRIAC_PRPS1_D</w:t>
+            </w:r>
+          </w:p>
+        </w:tc>
+        <w:tc>
+          <w:tcPr>
+            <w:tcW w:type="dxa" w:w="2880"/>
+            <w:vAlign w:val="center"/>
+          </w:tcPr>
+          <w:p>
+            <w:r/>
+            <w:r>
+              <w:t xml:space="preserve">Actual pattern is </w:t>
+            </w:r>
+            <w:r>
+              <w:rPr>
+                <w:rFonts w:ascii="Consolas" w:hAnsi="Consolas"/>
+                <w:sz w:val="20"/>
+              </w:rPr>
+              <w:t>delivery_&lt;N&gt;</w:t>
+            </w:r>
+            <w:r>
+              <w:t xml:space="preserve"> (e.g., </w:t>
+            </w:r>
+            <w:r>
+              <w:rPr>
+                <w:rFonts w:ascii="Consolas" w:hAnsi="Consolas"/>
+                <w:sz w:val="20"/>
+              </w:rPr>
+              <w:t>delivery_10</w:t>
+            </w:r>
+            <w:r>
+              <w:t>)</w:t>
+            </w:r>
+          </w:p>
+        </w:tc>
+        <w:tc>
+          <w:tcPr>
+            <w:tcW w:type="dxa" w:w="2880"/>
+            <w:vAlign w:val="center"/>
+          </w:tcPr>
+          <w:p>
+            <w:r/>
+            <w:r>
+              <w:t xml:space="preserve">LLD examples are illustrative; catalog in code uses </w:t>
+            </w:r>
+            <w:r>
+              <w:rPr>
+                <w:rFonts w:ascii="Consolas" w:hAnsi="Consolas"/>
+                <w:sz w:val="20"/>
+              </w:rPr>
+              <w:t>delivery_&lt;N&gt;</w:t>
+            </w:r>
+          </w:p>
+        </w:tc>
+      </w:tr>
+      <w:tr>
+        <w:tc>
+          <w:tcPr>
+            <w:tcW w:type="dxa" w:w="2880"/>
+            <w:vAlign w:val="center"/>
+          </w:tcPr>
+          <w:p>
+            <w:r/>
+            <w:r>
+              <w:t>DB credentials in env vars</w:t>
+            </w:r>
+          </w:p>
+        </w:tc>
+        <w:tc>
+          <w:tcPr>
+            <w:tcW w:type="dxa" w:w="2880"/>
+            <w:vAlign w:val="center"/>
+          </w:tcPr>
+          <w:p>
+            <w:r/>
+            <w:r>
+              <w:t xml:space="preserve">Hardcoded in </w:t>
+            </w:r>
+            <w:r>
+              <w:rPr>
+                <w:rFonts w:ascii="Consolas" w:hAnsi="Consolas"/>
+                <w:sz w:val="20"/>
+              </w:rPr>
+              <w:t>backend/database.py</w:t>
+            </w:r>
+          </w:p>
+        </w:tc>
+        <w:tc>
+          <w:tcPr>
+            <w:tcW w:type="dxa" w:w="2880"/>
+            <w:vAlign w:val="center"/>
+          </w:tcPr>
+          <w:p>
+            <w:r/>
+            <w:r>
+              <w:t>Security backlog item</w:t>
+            </w:r>
+          </w:p>
+        </w:tc>
+      </w:tr>
+      <w:tr>
+        <w:tc>
+          <w:tcPr>
+            <w:tcW w:type="dxa" w:w="2880"/>
+            <w:vAlign w:val="center"/>
+          </w:tcPr>
+          <w:p>
+            <w:r/>
+            <w:r>
+              <w:t xml:space="preserve">Pydantic schemas in </w:t>
+            </w:r>
+            <w:r>
+              <w:rPr>
+                <w:rFonts w:ascii="Consolas" w:hAnsi="Consolas"/>
+                <w:sz w:val="20"/>
+              </w:rPr>
+              <w:t>backend/schemas/</w:t>
+            </w:r>
+          </w:p>
+        </w:tc>
+        <w:tc>
+          <w:tcPr>
+            <w:tcW w:type="dxa" w:w="2880"/>
+            <w:vAlign w:val="center"/>
+          </w:tcPr>
+          <w:p>
+            <w:r/>
+            <w:r>
+              <w:t xml:space="preserve">Request models inline in </w:t>
+            </w:r>
+            <w:r>
+              <w:rPr>
+                <w:rFonts w:ascii="Consolas" w:hAnsi="Consolas"/>
+                <w:sz w:val="20"/>
+              </w:rPr>
+              <w:t>backend/main.py</w:t>
+            </w:r>
+          </w:p>
+        </w:tc>
+        <w:tc>
+          <w:tcPr>
+            <w:tcW w:type="dxa" w:w="2880"/>
+            <w:vAlign w:val="center"/>
+          </w:tcPr>
+          <w:p>
+            <w:r/>
+            <w:r>
+              <w:t>Refactor when backend grows</w:t>
+            </w:r>
+          </w:p>
+        </w:tc>
+      </w:tr>
+      <w:tr>
+        <w:tc>
+          <w:tcPr>
+            <w:tcW w:type="dxa" w:w="2880"/>
+            <w:vAlign w:val="center"/>
+          </w:tcPr>
+          <w:p>
+            <w:r/>
+            <w:r>
+              <w:rPr>
+                <w:rFonts w:ascii="Consolas" w:hAnsi="Consolas"/>
+                <w:sz w:val="20"/>
+              </w:rPr>
+              <w:t>settings.yaml</w:t>
+            </w:r>
+            <w:r>
+              <w:t xml:space="preserve"> for config</w:t>
+            </w:r>
+          </w:p>
+        </w:tc>
+        <w:tc>
+          <w:tcPr>
+            <w:tcW w:type="dxa" w:w="2880"/>
+            <w:vAlign w:val="center"/>
+          </w:tcPr>
+          <w:p>
+            <w:r/>
+            <w:r>
+              <w:t>No settings file; prompts loaded by filename</w:t>
+            </w:r>
+          </w:p>
+        </w:tc>
+        <w:tc>
+          <w:tcPr>
+            <w:tcW w:type="dxa" w:w="2880"/>
+            <w:vAlign w:val="center"/>
+          </w:tcPr>
+          <w:p>
+            <w:r/>
+            <w:r>
+              <w:t>Add when config surface grows</w:t>
+            </w:r>
+          </w:p>
+        </w:tc>
+      </w:tr>
+      <w:tr>
+        <w:tc>
+          <w:tcPr>
+            <w:tcW w:type="dxa" w:w="2880"/>
+            <w:vAlign w:val="center"/>
+          </w:tcPr>
+          <w:p>
+            <w:r/>
+            <w:r>
+              <w:t>Flyway migrations</w:t>
+            </w:r>
+          </w:p>
+        </w:tc>
+        <w:tc>
+          <w:tcPr>
+            <w:tcW w:type="dxa" w:w="2880"/>
+            <w:vAlign w:val="center"/>
+          </w:tcPr>
+          <w:p>
+            <w:r/>
+            <w:r>
+              <w:t>No migration files today</w:t>
+            </w:r>
+          </w:p>
+        </w:tc>
+        <w:tc>
+          <w:tcPr>
+            <w:tcW w:type="dxa" w:w="2880"/>
+            <w:vAlign w:val="center"/>
+          </w:tcPr>
+          <w:p>
+            <w:r/>
+            <w:r>
+              <w:t>Adopt when schema churns</w:t>
+            </w:r>
+          </w:p>
+        </w:tc>
+      </w:tr>
+      <w:tr>
+        <w:tc>
+          <w:tcPr>
+            <w:tcW w:type="dxa" w:w="2880"/>
+            <w:vAlign w:val="center"/>
+          </w:tcPr>
+          <w:p>
+            <w:r/>
+            <w:r>
+              <w:rPr>
+                <w:rFonts w:ascii="Consolas" w:hAnsi="Consolas"/>
+                <w:sz w:val="20"/>
+              </w:rPr>
+              <w:t>/v1/chat</w:t>
+            </w:r>
+            <w:r>
+              <w:t xml:space="preserve"> URI versioning</w:t>
+            </w:r>
+          </w:p>
+        </w:tc>
+        <w:tc>
+          <w:tcPr>
+            <w:tcW w:type="dxa" w:w="2880"/>
+            <w:vAlign w:val="center"/>
+          </w:tcPr>
+          <w:p>
+            <w:r/>
+            <w:r>
+              <w:t xml:space="preserve">Current path is </w:t>
+            </w:r>
+            <w:r>
+              <w:rPr>
+                <w:rFonts w:ascii="Consolas" w:hAnsi="Consolas"/>
+                <w:sz w:val="20"/>
+              </w:rPr>
+              <w:t>/api/agent/chat</w:t>
+            </w:r>
+          </w:p>
+        </w:tc>
+        <w:tc>
+          <w:tcPr>
+            <w:tcW w:type="dxa" w:w="2880"/>
+            <w:vAlign w:val="center"/>
+          </w:tcPr>
+          <w:p>
+            <w:r/>
+            <w:r>
+              <w:t>Adopt at first breaking change</w:t>
             </w:r>
           </w:p>
         </w:tc>
@@ -7954,6 +10222,18 @@
     </w:p>
     <w:p>
       <w:pPr>
+        <w:ind w:left="432"/>
+      </w:pPr>
+      <w:r>
+        <w:rPr>
+          <w:i/>
+          <w:color w:val="595959"/>
+        </w:rPr>
+        <w:t>**Status banner for Sections 6–11:** Mostly **IMPLEMENTED**. Seven domain prompts exist in `prompts/`, LLM normalization + regex fallback lives in `backend/llm_service.py:71-78`, session memory is a live dict in `backend/main.py`. **TARGET STATE** items: LangGraph StateGraph (§10 — only in legacy CLI scripts today), embedding-based RAG (§9.3), semantic cache (§9.4), prompt versioning in YAML (§6.4).</w:t>
+      </w:r>
+    </w:p>
+    <w:p>
+      <w:pPr>
         <w:pStyle w:val="Heading1"/>
       </w:pPr>
       <w:r>
@@ -13303,6 +15583,18 @@
     </w:p>
     <w:p>
       <w:pPr>
+        <w:ind w:left="432"/>
+      </w:pPr>
+      <w:r>
+        <w:rPr>
+          <w:i/>
+          <w:color w:val="595959"/>
+        </w:rPr>
+        <w:t>**Status banner for Sections 12–15: IMPLEMENTED.** The 3-panel React/Vite UI, FastAPI modular monolith, 30-second status polling, and REST integration all exist in the current codebase. The only **TARGET STATE** items in this part are TypeScript migration (§15.2), rate limits (§23.3), and SSE streaming (§14.1 alternative).</w:t>
+      </w:r>
+    </w:p>
+    <w:p>
+      <w:pPr>
         <w:pStyle w:val="Heading1"/>
       </w:pPr>
       <w:r>
@@ -18114,6 +20406,18 @@
     </w:p>
     <w:p>
       <w:pPr>
+        <w:ind w:left="432"/>
+      </w:pPr>
+      <w:r>
+        <w:rPr>
+          <w:i/>
+          <w:color w:val="595959"/>
+        </w:rPr>
+        <w:t>**Status banner for Sections 17–18**: **TARGET STATE (mostly).** The current codebase has no input filter, no output filter, no prompt-injection defenses, no circuit breakers, and no secrets-vaulting — only network-level trust. Everything in this part describes the design we intend to build. Items already in code are called out individually below.</w:t>
+      </w:r>
+    </w:p>
+    <w:p>
+      <w:pPr>
         <w:pStyle w:val="Heading1"/>
       </w:pPr>
       <w:r>
@@ -20658,6 +22962,18 @@
     </w:p>
     <w:p>
       <w:pPr>
+        <w:ind w:left="432"/>
+      </w:pPr>
+      <w:r>
+        <w:rPr>
+          <w:i/>
+          <w:color w:val="595959"/>
+        </w:rPr>
+        <w:t>**Status banner for Sections 20–26**: Large portions are **TARGET STATE**. Specifically: Testing (§20), Observability (§21), Cost Management (§22), CI/CD + Deployment (§25), and Reliability (§26) are mostly not yet in code. UX (§19) and API (§23) are partially shipped. See per-section banners for detail.</w:t>
+      </w:r>
+    </w:p>
+    <w:p>
+      <w:pPr>
         <w:pStyle w:val="Heading1"/>
       </w:pPr>
       <w:r>
@@ -21302,6 +23618,18 @@
           <w:color w:val="1F4E79"/>
         </w:rPr>
         <w:t>20. Testing Strategy</w:t>
+      </w:r>
+    </w:p>
+    <w:p>
+      <w:pPr>
+        <w:ind w:left="432"/>
+      </w:pPr>
+      <w:r>
+        <w:rPr>
+          <w:i/>
+          <w:color w:val="595959"/>
+        </w:rPr>
+        <w:t>**Status banner for Section 20: TARGET STATE.** No test files (pytest, Vitest, Playwright) exist in the repository today. No LLM eval harness, no golden sets, no CI test job. Everything below is the target test pyramid we intend to build.</w:t>
       </w:r>
     </w:p>
     <w:p>
@@ -22419,6 +24747,18 @@
     </w:p>
     <w:p>
       <w:pPr>
+        <w:ind w:left="432"/>
+      </w:pPr>
+      <w:r>
+        <w:rPr>
+          <w:i/>
+          <w:color w:val="595959"/>
+        </w:rPr>
+        <w:t>**Status banner for Section 21: TARGET STATE (mostly).** Today the backend writes to Python `stdout` logs only — no Prometheus client, no Grafana, no alerting rules, no trace IDs. The detailed observability stack below is the target.</w:t>
+      </w:r>
+    </w:p>
+    <w:p>
+      <w:pPr>
         <w:pStyle w:val="Heading2"/>
       </w:pPr>
       <w:r>
@@ -23926,6 +26266,18 @@
           <w:color w:val="1F4E79"/>
         </w:rPr>
         <w:t>22. Cost Management &amp; Optimization</w:t>
+      </w:r>
+    </w:p>
+    <w:p>
+      <w:pPr>
+        <w:ind w:left="432"/>
+      </w:pPr>
+      <w:r>
+        <w:rPr>
+          <w:i/>
+          <w:color w:val="595959"/>
+        </w:rPr>
+        <w:t>**Status banner for Section 22: TARGET STATE.** No cost metering, token budgeting, caching, or attribution exists in code today. The design below is what we plan to build.</w:t>
       </w:r>
     </w:p>
     <w:p>
@@ -27496,6 +29848,18 @@
     </w:p>
     <w:p>
       <w:pPr>
+        <w:ind w:left="432"/>
+      </w:pPr>
+      <w:r>
+        <w:rPr>
+          <w:i/>
+          <w:color w:val="595959"/>
+        </w:rPr>
+        <w:t>**Status banner for Section 25: TARGET STATE (mostly).** The repo has no `.github/workflows/`, no `Dockerfile`, no `terraform/` directory, and no blue/green scripts today. Deploys are manual (`python run_backend.py`, `npm run dev`). The design below is the target.</w:t>
+      </w:r>
+    </w:p>
+    <w:p>
+      <w:pPr>
         <w:pStyle w:val="Heading2"/>
       </w:pPr>
       <w:r>
@@ -28975,6 +31339,18 @@
           <w:color w:val="1F4E79"/>
         </w:rPr>
         <w:t>26. Reliability &amp; Resilience</w:t>
+      </w:r>
+    </w:p>
+    <w:p>
+      <w:pPr>
+        <w:ind w:left="432"/>
+      </w:pPr>
+      <w:r>
+        <w:rPr>
+          <w:i/>
+          <w:color w:val="595959"/>
+        </w:rPr>
+        <w:t>**Status banner for Section 26: TARGET STATE.** No SLO dashboards, no circuit breakers, no backup/restore drills, no defined RPO/RTO in code/config today. Basic `try/except` error handling exists in `backend/main.py`; everything else below is the target.</w:t>
       </w:r>
     </w:p>
     <w:p>

</xml_diff>